<commit_message>
Náhled smlouvy k zálohové faktuře, konečná faktura za 40 dní, drobné opravy textu
- Zvířata vrácena na tvrdý zákaz (pes/kočka v ceníku byl jen vzor).
- Sjednocený kontaktní telefon pro hlášení škod (605 357 011, 732 574 782)
  na hlavním webu a ve smlouvě; pražská kopie má nadále svoje číslo.
- Doplatek nájemného: pronajímatel posílá konečnou fakturu 40 dní předem,
  nájemce platí nejpozději 14 dní před převzetím (dřív nejednoznačná věta).
- Odstraněna "servisní knížka" (vozidlo ji nemá) ze sankcí i protokolu.
- Code.gs: automatická konečná faktura (doplatek) přes denní trigger 40 dní
  před převzetím, self-healing hlavička tabulky pro nový sloupec
  "Konečná faktura", a k zálohové faktuře se nově automaticky přikládá
  i PDF náhled smlouvy o nájmu s předvyplněnými údaji rezervace.
- Aktualizované vzory faktur a smlouvy v dokumenty/*.

Co-Authored-By: Claude Sonnet 5 <noreply@anthropic.com>
</commit_message>
<xml_diff>
--- a/dokumenty/Smlouva-o-najmu-obytneho-vozu.docx
+++ b/dokumenty/Smlouva-o-najmu-obytneho-vozu.docx
@@ -617,7 +617,7 @@
           <w:sz w:val="21"/>
           <w:szCs w:val="21"/>
         </w:rPr>
-        <w:t xml:space="preserve">Doplatek nájemného zašle pronajímatel nájemci formou konečné faktury nejpozději 30 dnů před počátkem doby nájmu a je splatný nejpozději při předání vozidla.</w:t>
+        <w:t xml:space="preserve">Pronajímatel zašle nájemci konečnou fakturu s doplatkem nájemného nejpozději 40 dnů před počátkem doby nájmu. Doplatek nájemného zašle nájemce nejpozději 14 dnů před počátkem doby nájmu.</w:t>
       </w:r>
     </w:p>
     <w:p>
@@ -939,7 +939,7 @@
           <w:sz w:val="21"/>
           <w:szCs w:val="21"/>
         </w:rPr>
-        <w:t xml:space="preserve">Přeprava psa nebo kočky je možná pouze jako předem objednaná příplatková výbava dle ceníku pronajímatele; bez předchozí domluvy je přeprava zvířat ve vozidle zakázána.</w:t>
+        <w:t xml:space="preserve">Přeprava domácích zvířat ve vozidle je zakázána.</w:t>
       </w:r>
     </w:p>
     <w:p>
@@ -957,7 +957,7 @@
           <w:sz w:val="21"/>
           <w:szCs w:val="21"/>
         </w:rPr>
-        <w:t xml:space="preserve">Nájemce je povinen řídit se pokyny pronajímatele k obsluze vozidla a v případě nejasností kontaktovat pronajímatele na tel. +420 603 169 518.</w:t>
+        <w:t xml:space="preserve">Nájemce je povinen řídit se pokyny pronajímatele k obsluze vozidla a v případě nejasností kontaktovat pronajímatele na tel. 605 357 011, 732 574 782.</w:t>
       </w:r>
     </w:p>
     <w:p>
@@ -1431,7 +1431,7 @@
           <w:sz w:val="21"/>
           <w:szCs w:val="21"/>
         </w:rPr>
-        <w:t xml:space="preserve">Za ztrátu klíčů od vozidla, osvědčení o registraci vozidla, zelené karty, servisní knížky nebo jiné dokumentace k vozidlu je nájemce povinen zaplatit pronajímateli smluvní pokutu ve výši 10 000 Kč.</w:t>
+        <w:t xml:space="preserve">Za ztrátu klíčů od vozidla, osvědčení o registraci vozidla, zelené karty nebo jiné dokumentace k vozidlu je nájemce povinen zaplatit pronajímateli smluvní pokutu ve výši 10 000 Kč.</w:t>
       </w:r>
     </w:p>
     <w:p>
@@ -2561,7 +2561,7 @@
                 <w:sz w:val="20"/>
                 <w:szCs w:val="20"/>
               </w:rPr>
-              <w:t xml:space="preserve">Klíče, OTP, zelená karta, servisní kniha</w:t>
+              <w:t xml:space="preserve">Klíče, OTP, zelená karta</w:t>
             </w:r>
           </w:p>
         </w:tc>
@@ -3291,7 +3291,7 @@
                 <w:sz w:val="20"/>
                 <w:szCs w:val="20"/>
               </w:rPr>
-              <w:t xml:space="preserve">Klíče, OTP, zelená karta, servisní kniha</w:t>
+              <w:t xml:space="preserve">Klíče, OTP, zelená karta</w:t>
             </w:r>
           </w:p>
         </w:tc>

</xml_diff>